<commit_message>
Correct Bolt.new bullets: measurement framework, not a dashboard; add copy desk
The PR/GEO/AEO dashboard is no longer in use, so both CLAUDE.md and
the recruiter resume now say measurement framework instead. Also adds
the Claude-linked copy desk (an editorial review tool) to the AI tool
stack bullet in both places, since it was missing from the record.

Co-Authored-By: Claude Sonnet 5 <noreply@anthropic.com>
Claude-Session: https://claude.ai/code/session_01HGwMf3WQEWpBH5LDYWi1id
</commit_message>
<xml_diff>
--- a/Taylor-Bornstein-Resume-Recruiter.docx
+++ b/Taylor-Bornstein-Resume-Recruiter.docx
@@ -149,7 +149,7 @@
           <w:sz w:val="20"/>
           <w:szCs w:val="20"/>
         </w:rPr>
-        <w:t xml:space="preserve">Built and rolled out an AI-powered tool stack for content strategy, copywriting, editing, and research, distributed company-wide and across the creator and agency network.</w:t>
+        <w:t xml:space="preserve">Built and rolled out an AI-powered tool stack for content strategy, copywriting, editing, and research, including a Claude-linked copy desk for editorial review, distributed company-wide and across the creator and agency network.</w:t>
       </w:r>
     </w:p>
     <w:p>
@@ -185,7 +185,7 @@
           <w:sz w:val="20"/>
           <w:szCs w:val="20"/>
         </w:rPr>
-        <w:t xml:space="preserve">Extended earned media coverage beyond the US into the UK; built a custom dashboard for PR metrics and GEO/AEO tracking.</w:t>
+        <w:t xml:space="preserve">Extended earned media coverage beyond the US into the UK; built a measurement framework for PR and GEO/AEO performance.</w:t>
       </w:r>
     </w:p>
     <w:p>

</xml_diff>

<commit_message>
Drop title line, fold content calendar into the AI tool suite bullet
Removes the "Director of Content & Communications" subtitle under the
name. Reworks the first Bolt.new bullet from a narrow "AI-powered tool
stack" into the broader content and writing suite it actually is,
now naming both the Claude-linked copy desk and the custom content
calendar the team runs on.

Co-Authored-By: Claude Sonnet 5 <noreply@anthropic.com>
Claude-Session: https://claude.ai/code/session_01HGwMf3WQEWpBH5LDYWi1id
</commit_message>
<xml_diff>
--- a/Taylor-Bornstein-Resume-Recruiter.docx
+++ b/Taylor-Bornstein-Resume-Recruiter.docx
@@ -16,21 +16,6 @@
           <w:szCs w:val="34"/>
         </w:rPr>
         <w:t xml:space="preserve">Taylor Bornstein</w:t>
-      </w:r>
-    </w:p>
-    <w:p>
-      <w:pPr>
-        <w:spacing w:after="20"/>
-        <w:jc w:val="center"/>
-      </w:pPr>
-      <w:r>
-        <w:rPr>
-          <w:rFonts w:ascii="Calibri" w:cs="Calibri" w:eastAsia="Calibri" w:hAnsi="Calibri"/>
-          <w:color w:val="333333"/>
-          <w:sz w:val="22"/>
-          <w:szCs w:val="22"/>
-        </w:rPr>
-        <w:t xml:space="preserve">Director of Content &amp; Communications</w:t>
       </w:r>
     </w:p>
     <w:p>
@@ -149,7 +134,7 @@
           <w:sz w:val="20"/>
           <w:szCs w:val="20"/>
         </w:rPr>
-        <w:t xml:space="preserve">Built and rolled out an AI-powered tool stack for content strategy, copywriting, editing, and research, including a Claude-linked copy desk for editorial review, distributed company-wide and across the creator and agency network.</w:t>
+        <w:t xml:space="preserve">Built and rolled out a content and writing suite of AI tools — a Claude-linked copy desk for editorial review, plus the custom content calendar the team runs on — distributed company-wide and across the creator and agency network.</w:t>
       </w:r>
     </w:p>
     <w:p>

</xml_diff>

<commit_message>
Reorder for content-director focus, add hands-on writing, restore Internet Brands
Content strategy/programming now leads each role block, PR moved
second, matching a content-director search rather than a broader
comms/PR one. Adds a bullet on personally writing and editing blogs,
customer stories, and web copy (also added to CLAUDE.md as a durable
fact). Restores the Internet Brands block, both for length/depth and
because it reinforces the hands-on-writing thread.

Co-Authored-By: Claude Sonnet 5 <noreply@anthropic.com>
Claude-Session: https://claude.ai/code/session_01HGwMf3WQEWpBH5LDYWi1id
</commit_message>
<xml_diff>
--- a/Taylor-Bornstein-Resume-Recruiter.docx
+++ b/Taylor-Bornstein-Resume-Recruiter.docx
@@ -51,7 +51,7 @@
           <w:sz w:val="20"/>
           <w:szCs w:val="20"/>
         </w:rPr>
-        <w:t xml:space="preserve">Content and communications leader who builds the systems — editorial infrastructure, AI tooling, measurement, and teams — that let technical companies say something worth reading, consistently. A decade shaping how tech brands talk to developers, engineering managers, and executives.</w:t>
+        <w:t xml:space="preserve">Content director who builds content strategy and the programs that scale it — editorial infrastructure, AI tooling, measurement, and teams — for technical and executive audiences. Stays hands-on: writes and edits the blogs, customer stories, and web pages the strategy runs on.</w:t>
       </w:r>
     </w:p>
     <w:p>
@@ -67,7 +67,7 @@
           <w:sz w:val="18"/>
           <w:szCs w:val="18"/>
         </w:rPr>
-        <w:t xml:space="preserve">Content Strategy &amp; Editorial Programs  ·  Team Building  ·  AI Tooling for Content  ·  PR &amp; Thought Leadership  ·  SEO / GEO &amp; Attribution  ·  B2B &amp; B2C Messaging</w:t>
+        <w:t xml:space="preserve">Content Strategy &amp; Editorial Programs  ·  Hands-On Writing &amp; Editing  ·  Team Building  ·  AI Tooling for Content  ·  SEO / GEO &amp; Attribution  ·  PR &amp; Thought Leadership</w:t>
       </w:r>
     </w:p>
     <w:p>
@@ -134,6 +134,42 @@
           <w:sz w:val="20"/>
           <w:szCs w:val="20"/>
         </w:rPr>
+        <w:t xml:space="preserve">Set content strategy across B2B and B2C messaging: launched a new blog, increased publication cadence from 1–2 posts/month to 1–2/week, and built a customer story pipeline sourced from B2C customers.</w:t>
+      </w:r>
+    </w:p>
+    <w:p>
+      <w:pPr>
+        <w:pStyle w:val="ListParagraph"/>
+        <w:numPr>
+          <w:ilvl w:val="0"/>
+          <w:numId w:val="2"/>
+        </w:numPr>
+        <w:spacing w:after="20" w:before="0"/>
+      </w:pPr>
+      <w:r>
+        <w:rPr>
+          <w:rFonts w:ascii="Calibri" w:cs="Calibri" w:eastAsia="Calibri" w:hAnsi="Calibri"/>
+          <w:sz w:val="20"/>
+          <w:szCs w:val="20"/>
+        </w:rPr>
+        <w:t xml:space="preserve">Personally write and edit ongoing blog posts, customer stories, and web copy — stays hands-on with execution while setting the strategy the rest of the team builds against.</w:t>
+      </w:r>
+    </w:p>
+    <w:p>
+      <w:pPr>
+        <w:pStyle w:val="ListParagraph"/>
+        <w:numPr>
+          <w:ilvl w:val="0"/>
+          <w:numId w:val="2"/>
+        </w:numPr>
+        <w:spacing w:after="20" w:before="0"/>
+      </w:pPr>
+      <w:r>
+        <w:rPr>
+          <w:rFonts w:ascii="Calibri" w:cs="Calibri" w:eastAsia="Calibri" w:hAnsi="Calibri"/>
+          <w:sz w:val="20"/>
+          <w:szCs w:val="20"/>
+        </w:rPr>
         <w:t xml:space="preserve">Built and rolled out a content and writing suite of AI tools — a Claude-linked copy desk for editorial review, plus the custom content calendar the team runs on — distributed company-wide and across the creator and agency network.</w:t>
       </w:r>
     </w:p>
@@ -152,6 +188,24 @@
           <w:sz w:val="20"/>
           <w:szCs w:val="20"/>
         </w:rPr>
+        <w:t xml:space="preserve">Led foundational brand work spanning mission, vision, tone of voice, and editorial guidelines.</w:t>
+      </w:r>
+    </w:p>
+    <w:p>
+      <w:pPr>
+        <w:pStyle w:val="ListParagraph"/>
+        <w:numPr>
+          <w:ilvl w:val="0"/>
+          <w:numId w:val="2"/>
+        </w:numPr>
+        <w:spacing w:after="20" w:before="0"/>
+      </w:pPr>
+      <w:r>
+        <w:rPr>
+          <w:rFonts w:ascii="Calibri" w:cs="Calibri" w:eastAsia="Calibri" w:hAnsi="Calibri"/>
+          <w:sz w:val="20"/>
+          <w:szCs w:val="20"/>
+        </w:rPr>
         <w:t xml:space="preserve">Established a new PR program from the ground up: defined the enterprise audience, mapped the media universe, and expanded the spokesperson bench from 1 to 6.</w:t>
       </w:r>
     </w:p>
@@ -171,42 +225,6 @@
           <w:szCs w:val="20"/>
         </w:rPr>
         <w:t xml:space="preserve">Extended earned media coverage beyond the US into the UK; built a measurement framework for PR and GEO/AEO performance.</w:t>
-      </w:r>
-    </w:p>
-    <w:p>
-      <w:pPr>
-        <w:pStyle w:val="ListParagraph"/>
-        <w:numPr>
-          <w:ilvl w:val="0"/>
-          <w:numId w:val="2"/>
-        </w:numPr>
-        <w:spacing w:after="20" w:before="0"/>
-      </w:pPr>
-      <w:r>
-        <w:rPr>
-          <w:rFonts w:ascii="Calibri" w:cs="Calibri" w:eastAsia="Calibri" w:hAnsi="Calibri"/>
-          <w:sz w:val="20"/>
-          <w:szCs w:val="20"/>
-        </w:rPr>
-        <w:t xml:space="preserve">Set content strategy across B2B and B2C messaging; launched a new blog and increased publication cadence from 1–2 posts/month to 1–2/week.</w:t>
-      </w:r>
-    </w:p>
-    <w:p>
-      <w:pPr>
-        <w:pStyle w:val="ListParagraph"/>
-        <w:numPr>
-          <w:ilvl w:val="0"/>
-          <w:numId w:val="2"/>
-        </w:numPr>
-        <w:spacing w:after="20" w:before="0"/>
-      </w:pPr>
-      <w:r>
-        <w:rPr>
-          <w:rFonts w:ascii="Calibri" w:cs="Calibri" w:eastAsia="Calibri" w:hAnsi="Calibri"/>
-          <w:sz w:val="20"/>
-          <w:szCs w:val="20"/>
-        </w:rPr>
-        <w:t xml:space="preserve">Led foundational brand work spanning mission, vision, tone of voice, and editorial guidelines; built a customer story pipeline sourced from B2C customers.</w:t>
       </w:r>
     </w:p>
     <w:p>
@@ -253,43 +271,43 @@
           <w:sz w:val="20"/>
           <w:szCs w:val="20"/>
         </w:rPr>
+        <w:t xml:space="preserve">Planned and executed an integrated campaign built on an original global survey in 4 months: coverage up 75% within 3 weeks, $10M influenced pipeline.</w:t>
+      </w:r>
+    </w:p>
+    <w:p>
+      <w:pPr>
+        <w:pStyle w:val="ListParagraph"/>
+        <w:numPr>
+          <w:ilvl w:val="0"/>
+          <w:numId w:val="2"/>
+        </w:numPr>
+        <w:spacing w:after="20" w:before="0"/>
+      </w:pPr>
+      <w:r>
+        <w:rPr>
+          <w:rFonts w:ascii="Calibri" w:cs="Calibri" w:eastAsia="Calibri" w:hAnsi="Calibri"/>
+          <w:sz w:val="20"/>
+          <w:szCs w:val="20"/>
+        </w:rPr>
+        <w:t xml:space="preserve">Optimized a $1M annual budget, reallocating toward high-impact initiatives.</w:t>
+      </w:r>
+    </w:p>
+    <w:p>
+      <w:pPr>
+        <w:pStyle w:val="ListParagraph"/>
+        <w:numPr>
+          <w:ilvl w:val="0"/>
+          <w:numId w:val="2"/>
+        </w:numPr>
+        <w:spacing w:after="20" w:before="0"/>
+      </w:pPr>
+      <w:r>
+        <w:rPr>
+          <w:rFonts w:ascii="Calibri" w:cs="Calibri" w:eastAsia="Calibri" w:hAnsi="Calibri"/>
+          <w:sz w:val="20"/>
+          <w:szCs w:val="20"/>
+        </w:rPr>
         <w:t xml:space="preserve">Ran a data-driven PR program across 5 agencies (US, UK, Benelux, DACH, Singapore); drove earned media to 60% of total coverage in tier-1 publications, a 40% YoY increase.</w:t>
-      </w:r>
-    </w:p>
-    <w:p>
-      <w:pPr>
-        <w:pStyle w:val="ListParagraph"/>
-        <w:numPr>
-          <w:ilvl w:val="0"/>
-          <w:numId w:val="2"/>
-        </w:numPr>
-        <w:spacing w:after="20" w:before="0"/>
-      </w:pPr>
-      <w:r>
-        <w:rPr>
-          <w:rFonts w:ascii="Calibri" w:cs="Calibri" w:eastAsia="Calibri" w:hAnsi="Calibri"/>
-          <w:sz w:val="20"/>
-          <w:szCs w:val="20"/>
-        </w:rPr>
-        <w:t xml:space="preserve">Optimized a $1M annual budget, reallocating toward high-impact initiatives.</w:t>
-      </w:r>
-    </w:p>
-    <w:p>
-      <w:pPr>
-        <w:pStyle w:val="ListParagraph"/>
-        <w:numPr>
-          <w:ilvl w:val="0"/>
-          <w:numId w:val="2"/>
-        </w:numPr>
-        <w:spacing w:after="20" w:before="0"/>
-      </w:pPr>
-      <w:r>
-        <w:rPr>
-          <w:rFonts w:ascii="Calibri" w:cs="Calibri" w:eastAsia="Calibri" w:hAnsi="Calibri"/>
-          <w:sz w:val="20"/>
-          <w:szCs w:val="20"/>
-        </w:rPr>
-        <w:t xml:space="preserve">Planned and executed an integrated campaign built on an original global survey in 4 months: coverage up 75% within 3 weeks, $10M influenced pipeline.</w:t>
       </w:r>
     </w:p>
     <w:p>
@@ -467,6 +485,53 @@
           <w:szCs w:val="20"/>
         </w:rPr>
         <w:t xml:space="preserve">Built a thought-leadership microsite from concept through launch; implemented full-funnel, multi-channel content plans tailored to customer personas across product lines and geographies.</w:t>
+      </w:r>
+    </w:p>
+    <w:p>
+      <w:pPr>
+        <w:tabs>
+          <w:tab w:val="right" w:pos="10800"/>
+        </w:tabs>
+        <w:spacing w:after="20" w:before="100"/>
+      </w:pPr>
+      <w:r>
+        <w:rPr>
+          <w:rFonts w:ascii="Calibri" w:cs="Calibri" w:eastAsia="Calibri" w:hAnsi="Calibri"/>
+          <w:b/>
+          <w:bCs/>
+          <w:sz w:val="20"/>
+          <w:szCs w:val="20"/>
+        </w:rPr>
+        <w:t xml:space="preserve">Internet Brands — Content Editor &amp; Manager, Retail Marketing</w:t>
+      </w:r>
+      <w:r>
+        <w:rPr>
+          <w:rFonts w:ascii="Calibri" w:cs="Calibri" w:eastAsia="Calibri" w:hAnsi="Calibri"/>
+          <w:i/>
+          <w:iCs/>
+          <w:color w:val="444444"/>
+          <w:sz w:val="18"/>
+          <w:szCs w:val="18"/>
+        </w:rPr>
+        <w:t xml:space="preserve">	2009 – 2014  |  Remote</w:t>
+      </w:r>
+    </w:p>
+    <w:p>
+      <w:pPr>
+        <w:pStyle w:val="ListParagraph"/>
+        <w:numPr>
+          <w:ilvl w:val="0"/>
+          <w:numId w:val="2"/>
+        </w:numPr>
+        <w:spacing w:after="20" w:before="0"/>
+      </w:pPr>
+      <w:r>
+        <w:rPr>
+          <w:rFonts w:ascii="Calibri" w:cs="Calibri" w:eastAsia="Calibri" w:hAnsi="Calibri"/>
+          <w:sz w:val="20"/>
+          <w:szCs w:val="20"/>
+        </w:rPr>
+        <w:t xml:space="preserve">Wrote copy for up to five retail websites daily while managing and training a team of 5–8 writers, maintaining a distinct brand voice across a portfolio of consumer brands.</w:t>
       </w:r>
     </w:p>
     <w:p>

</xml_diff>

<commit_message>
Add GEO/AEO citation and visibility work, backed by real MoM numbers
Replaces the vague "measurement framework" bullet with a specific,
data-backed one: diagnosed AI-answer visibility/citation gaps, built
and executed a GEO/AEO content strategy, and drove own-domain
citations from 786 to 1,809 in a month (#9 to #5) while holding #1 in
AI-answer visibility (57.3%, +3.6pp MoM). Added to CLAUDE.md as a
durable fact as well.

Co-Authored-By: Claude Sonnet 5 <noreply@anthropic.com>
Claude-Session: https://claude.ai/code/session_01HGwMf3WQEWpBH5LDYWi1id
</commit_message>
<xml_diff>
--- a/Taylor-Bornstein-Resume-Recruiter.docx
+++ b/Taylor-Bornstein-Resume-Recruiter.docx
@@ -170,6 +170,24 @@
           <w:sz w:val="20"/>
           <w:szCs w:val="20"/>
         </w:rPr>
+        <w:t xml:space="preserve">Diagnosed AI-answer visibility and citation performance, then built and executed a GEO/AEO content strategy against the gaps: grew own-domain citations from 786 to 1,809 in a month (#9 → #5 among all cited domains, the largest gain in the top 25) while holding #1 in AI-answer visibility (57.3%, +3.6 points month-over-month).</w:t>
+      </w:r>
+    </w:p>
+    <w:p>
+      <w:pPr>
+        <w:pStyle w:val="ListParagraph"/>
+        <w:numPr>
+          <w:ilvl w:val="0"/>
+          <w:numId w:val="2"/>
+        </w:numPr>
+        <w:spacing w:after="20" w:before="0"/>
+      </w:pPr>
+      <w:r>
+        <w:rPr>
+          <w:rFonts w:ascii="Calibri" w:cs="Calibri" w:eastAsia="Calibri" w:hAnsi="Calibri"/>
+          <w:sz w:val="20"/>
+          <w:szCs w:val="20"/>
+        </w:rPr>
         <w:t xml:space="preserve">Built and rolled out a content and writing suite of AI tools — a Claude-linked copy desk for editorial review, plus the custom content calendar the team runs on — distributed company-wide and across the creator and agency network.</w:t>
       </w:r>
     </w:p>
@@ -224,7 +242,7 @@
           <w:sz w:val="20"/>
           <w:szCs w:val="20"/>
         </w:rPr>
-        <w:t xml:space="preserve">Extended earned media coverage beyond the US into the UK; built a measurement framework for PR and GEO/AEO performance.</w:t>
+        <w:t xml:space="preserve">Extended earned media coverage beyond the US into the UK.</w:t>
       </w:r>
     </w:p>
     <w:p>

</xml_diff>

<commit_message>
Correct Iron Mountain dates, add freelance-era work, fix false tenure claim
Iron Mountain corrected to Sep 2016 - Aug 2019 (was showing a
fabricated Jul 2015 start that erased a real ~2-year gap). Adds the
freelance era that actually covers that gap: Freelance Writer &
Editor (Aug 2014 - Sep 2016, corrected from an initial guess of
Sep 2014 against the user's LinkedIn export) covering clients
including Benefitness Health Club and NANETS, plus the concurrent
Benefitness Health Club marketing manager role. Rewrites CLAUDE.md's
tenure-context interview talking point, which previously claimed
"10.5 consecutive years, no gap" based on the fabricated date - the
real chronology (verified against LinkedIn) has no actual gap either,
just via a different, accurate path.

Co-Authored-By: Claude Sonnet 5 <noreply@anthropic.com>
Claude-Session: https://claude.ai/code/session_01HGwMf3WQEWpBH5LDYWi1id
</commit_message>
<xml_diff>
--- a/Taylor-Bornstein-Resume-Recruiter.docx
+++ b/Taylor-Bornstein-Resume-Recruiter.docx
@@ -484,7 +484,7 @@
           <w:sz w:val="18"/>
           <w:szCs w:val="18"/>
         </w:rPr>
-        <w:t xml:space="preserve">	Jul 2015 – Aug 2019  |  Boston, MA</w:t>
+        <w:t xml:space="preserve">	Sep 2016 – Aug 2019  |  Boston, MA</w:t>
       </w:r>
     </w:p>
     <w:p>
@@ -503,6 +503,100 @@
           <w:szCs w:val="20"/>
         </w:rPr>
         <w:t xml:space="preserve">Built a thought-leadership microsite from concept through launch; implemented full-funnel, multi-channel content plans tailored to customer personas across product lines and geographies.</w:t>
+      </w:r>
+    </w:p>
+    <w:p>
+      <w:pPr>
+        <w:tabs>
+          <w:tab w:val="right" w:pos="10800"/>
+        </w:tabs>
+        <w:spacing w:after="20" w:before="100"/>
+      </w:pPr>
+      <w:r>
+        <w:rPr>
+          <w:rFonts w:ascii="Calibri" w:cs="Calibri" w:eastAsia="Calibri" w:hAnsi="Calibri"/>
+          <w:b/>
+          <w:bCs/>
+          <w:sz w:val="20"/>
+          <w:szCs w:val="20"/>
+        </w:rPr>
+        <w:t xml:space="preserve">Benefitness Health Club — Marketing Manager</w:t>
+      </w:r>
+      <w:r>
+        <w:rPr>
+          <w:rFonts w:ascii="Calibri" w:cs="Calibri" w:eastAsia="Calibri" w:hAnsi="Calibri"/>
+          <w:i/>
+          <w:iCs/>
+          <w:color w:val="444444"/>
+          <w:sz w:val="18"/>
+          <w:szCs w:val="18"/>
+        </w:rPr>
+        <w:t xml:space="preserve">	May 2015 – Aug 2016  |  Brookline, MA</w:t>
+      </w:r>
+    </w:p>
+    <w:p>
+      <w:pPr>
+        <w:pStyle w:val="ListParagraph"/>
+        <w:numPr>
+          <w:ilvl w:val="0"/>
+          <w:numId w:val="2"/>
+        </w:numPr>
+        <w:spacing w:after="20" w:before="0"/>
+      </w:pPr>
+      <w:r>
+        <w:rPr>
+          <w:rFonts w:ascii="Calibri" w:cs="Calibri" w:eastAsia="Calibri" w:hAnsi="Calibri"/>
+          <w:sz w:val="20"/>
+          <w:szCs w:val="20"/>
+        </w:rPr>
+        <w:t xml:space="preserve">Developed and implemented marketing campaigns promoting membership and gym services.</w:t>
+      </w:r>
+    </w:p>
+    <w:p>
+      <w:pPr>
+        <w:tabs>
+          <w:tab w:val="right" w:pos="10800"/>
+        </w:tabs>
+        <w:spacing w:after="20" w:before="100"/>
+      </w:pPr>
+      <w:r>
+        <w:rPr>
+          <w:rFonts w:ascii="Calibri" w:cs="Calibri" w:eastAsia="Calibri" w:hAnsi="Calibri"/>
+          <w:b/>
+          <w:bCs/>
+          <w:sz w:val="20"/>
+          <w:szCs w:val="20"/>
+        </w:rPr>
+        <w:t xml:space="preserve">Freelance Writer &amp; Editor — Self-Employed</w:t>
+      </w:r>
+      <w:r>
+        <w:rPr>
+          <w:rFonts w:ascii="Calibri" w:cs="Calibri" w:eastAsia="Calibri" w:hAnsi="Calibri"/>
+          <w:i/>
+          <w:iCs/>
+          <w:color w:val="444444"/>
+          <w:sz w:val="18"/>
+          <w:szCs w:val="18"/>
+        </w:rPr>
+        <w:t xml:space="preserve">	Aug 2014 – Sep 2016  |  Remote</w:t>
+      </w:r>
+    </w:p>
+    <w:p>
+      <w:pPr>
+        <w:pStyle w:val="ListParagraph"/>
+        <w:numPr>
+          <w:ilvl w:val="0"/>
+          <w:numId w:val="2"/>
+        </w:numPr>
+        <w:spacing w:after="20" w:before="0"/>
+      </w:pPr>
+      <w:r>
+        <w:rPr>
+          <w:rFonts w:ascii="Calibri" w:cs="Calibri" w:eastAsia="Calibri" w:hAnsi="Calibri"/>
+          <w:sz w:val="20"/>
+          <w:szCs w:val="20"/>
+        </w:rPr>
+        <w:t xml:space="preserve">Wrote blog articles, SEO web content, product reviews, and ghostwriting for clients including Benefitness Health Club, the North American Neuroendocrine Tumor Society (NANETS), and individual private clients; also designed and built client websites.</w:t>
       </w:r>
     </w:p>
     <w:p>

</xml_diff>

<commit_message>
Fold in user's direct edits to the resume
Summary rewritten, GEO/AEO bullet now names the "AI development
tools" category, AI tool suite bullet reworded, PR bullet merged with
the UK earned-media line and adds the entrepreneur audience segment,
Mendix campaign bullet clarifies "from the previous year," and the
degree is now MA in Creative Writing. Synced the entrepreneur-audience
and degree-name facts to CLAUDE.md as well.

Co-Authored-By: Claude Sonnet 5 <noreply@anthropic.com>
Claude-Session: https://claude.ai/code/session_01HGwMf3WQEWpBH5LDYWi1id
</commit_message>
<xml_diff>
--- a/Taylor-Bornstein-Resume-Recruiter.docx
+++ b/Taylor-Bornstein-Resume-Recruiter.docx
@@ -51,7 +51,7 @@
           <w:sz w:val="20"/>
           <w:szCs w:val="20"/>
         </w:rPr>
-        <w:t xml:space="preserve">Content director who builds content strategy and the programs that scale it — editorial infrastructure, AI tooling, measurement, and teams — for technical and executive audiences. Stays hands-on: writes and edits the blogs, customer stories, and web pages the strategy runs on.</w:t>
+        <w:t xml:space="preserve">Content director who builds content strategy and the programs that scale it for technical and executive audiences. Proven capacity to build thriving practices from the ground up, including: the editorial infrastructure, AI tooling, measurement, and teams.</w:t>
       </w:r>
     </w:p>
     <w:p>
@@ -152,43 +152,43 @@
           <w:sz w:val="20"/>
           <w:szCs w:val="20"/>
         </w:rPr>
-        <w:t xml:space="preserve">Personally write and edit ongoing blog posts, customer stories, and web copy — stays hands-on with execution while setting the strategy the rest of the team builds against.</w:t>
-      </w:r>
-    </w:p>
-    <w:p>
-      <w:pPr>
-        <w:pStyle w:val="ListParagraph"/>
-        <w:numPr>
-          <w:ilvl w:val="0"/>
-          <w:numId w:val="2"/>
-        </w:numPr>
-        <w:spacing w:after="20" w:before="0"/>
-      </w:pPr>
-      <w:r>
-        <w:rPr>
-          <w:rFonts w:ascii="Calibri" w:cs="Calibri" w:eastAsia="Calibri" w:hAnsi="Calibri"/>
-          <w:sz w:val="20"/>
-          <w:szCs w:val="20"/>
-        </w:rPr>
-        <w:t xml:space="preserve">Diagnosed AI-answer visibility and citation performance, then built and executed a GEO/AEO content strategy against the gaps: grew own-domain citations from 786 to 1,809 in a month (#9 → #5 among all cited domains, the largest gain in the top 25) while holding #1 in AI-answer visibility (57.3%, +3.6 points month-over-month).</w:t>
-      </w:r>
-    </w:p>
-    <w:p>
-      <w:pPr>
-        <w:pStyle w:val="ListParagraph"/>
-        <w:numPr>
-          <w:ilvl w:val="0"/>
-          <w:numId w:val="2"/>
-        </w:numPr>
-        <w:spacing w:after="20" w:before="0"/>
-      </w:pPr>
-      <w:r>
-        <w:rPr>
-          <w:rFonts w:ascii="Calibri" w:cs="Calibri" w:eastAsia="Calibri" w:hAnsi="Calibri"/>
-          <w:sz w:val="20"/>
-          <w:szCs w:val="20"/>
-        </w:rPr>
-        <w:t xml:space="preserve">Built and rolled out a content and writing suite of AI tools — a Claude-linked copy desk for editorial review, plus the custom content calendar the team runs on — distributed company-wide and across the creator and agency network.</w:t>
+        <w:t xml:space="preserve">Personally write and edit ongoing blog posts, customer stories, and web copy, staying hands-on with execution while setting the strategy the rest of the team builds against.</w:t>
+      </w:r>
+    </w:p>
+    <w:p>
+      <w:pPr>
+        <w:pStyle w:val="ListParagraph"/>
+        <w:numPr>
+          <w:ilvl w:val="0"/>
+          <w:numId w:val="2"/>
+        </w:numPr>
+        <w:spacing w:after="20" w:before="0"/>
+      </w:pPr>
+      <w:r>
+        <w:rPr>
+          <w:rFonts w:ascii="Calibri" w:cs="Calibri" w:eastAsia="Calibri" w:hAnsi="Calibri"/>
+          <w:sz w:val="20"/>
+          <w:szCs w:val="20"/>
+        </w:rPr>
+        <w:t xml:space="preserve">Diagnosed AI-answer visibility and citation performance, then built and executed a GEO/AEO content strategy against the gaps: grew own-domain citations from 786 to 1,809 in a month (#9 → #5 among all cited domains, the largest gain in the top 25) while holding #1 in AI-answer visibility in "AI development tools" category (57.3%, +3.6 points month-over-month).</w:t>
+      </w:r>
+    </w:p>
+    <w:p>
+      <w:pPr>
+        <w:pStyle w:val="ListParagraph"/>
+        <w:numPr>
+          <w:ilvl w:val="0"/>
+          <w:numId w:val="2"/>
+        </w:numPr>
+        <w:spacing w:after="20" w:before="0"/>
+      </w:pPr>
+      <w:r>
+        <w:rPr>
+          <w:rFonts w:ascii="Calibri" w:cs="Calibri" w:eastAsia="Calibri" w:hAnsi="Calibri"/>
+          <w:sz w:val="20"/>
+          <w:szCs w:val="20"/>
+        </w:rPr>
+        <w:t xml:space="preserve">Built and rolled out a content and writing suite of AI tools and distributed them company-wide. Also built a Claude-linked copy desk for editorial review, plus a custom content calendar for content and PR.</w:t>
       </w:r>
     </w:p>
     <w:p>
@@ -224,25 +224,7 @@
           <w:sz w:val="20"/>
           <w:szCs w:val="20"/>
         </w:rPr>
-        <w:t xml:space="preserve">Established a new PR program from the ground up: defined the enterprise audience, mapped the media universe, and expanded the spokesperson bench from 1 to 6.</w:t>
-      </w:r>
-    </w:p>
-    <w:p>
-      <w:pPr>
-        <w:pStyle w:val="ListParagraph"/>
-        <w:numPr>
-          <w:ilvl w:val="0"/>
-          <w:numId w:val="2"/>
-        </w:numPr>
-        <w:spacing w:after="20" w:before="0"/>
-      </w:pPr>
-      <w:r>
-        <w:rPr>
-          <w:rFonts w:ascii="Calibri" w:cs="Calibri" w:eastAsia="Calibri" w:hAnsi="Calibri"/>
-          <w:sz w:val="20"/>
-          <w:szCs w:val="20"/>
-        </w:rPr>
-        <w:t xml:space="preserve">Extended earned media coverage beyond the US into the UK.</w:t>
+        <w:t xml:space="preserve">Established a new PR program from the ground up: defined the enterprise and entrepreneur audience, mapped the media universe, and expanded the spokesperson bench from 1 to 6. Extended earned media coverage beyond the US into the UK.</w:t>
       </w:r>
     </w:p>
     <w:p>
@@ -289,7 +271,7 @@
           <w:sz w:val="20"/>
           <w:szCs w:val="20"/>
         </w:rPr>
-        <w:t xml:space="preserve">Planned and executed an integrated campaign built on an original global survey in 4 months: coverage up 75% within 3 weeks, $10M influenced pipeline.</w:t>
+        <w:t xml:space="preserve">Planned and executed an integrated campaign built on an original global survey in 4 months: coverage up 75% within 3 weeks from the previous year, $10M influenced pipeline.</w:t>
       </w:r>
     </w:p>
     <w:p>
@@ -676,7 +658,7 @@
           <w:sz w:val="20"/>
           <w:szCs w:val="20"/>
         </w:rPr>
-        <w:t xml:space="preserve">MA in Writing, University of Warwick  ·  BA in English &amp; Spanish, University of Vermont (cum laude)</w:t>
+        <w:t xml:space="preserve">MA in Creative Writing, University of Warwick  ·  BA in English &amp; Spanish, University of Vermont (cum laude)</w:t>
       </w:r>
     </w:p>
     <w:sectPr>

</xml_diff>

<commit_message>
Switch resume font to Cambria, record as a standing document preference
Co-Authored-By: Claude Sonnet 5 <noreply@anthropic.com>
Claude-Session: https://claude.ai/code/session_01HGwMf3WQEWpBH5LDYWi1id
</commit_message>
<xml_diff>
--- a/Taylor-Bornstein-Resume-Recruiter.docx
+++ b/Taylor-Bornstein-Resume-Recruiter.docx
@@ -9,7 +9,7 @@
       </w:pPr>
       <w:r>
         <w:rPr>
-          <w:rFonts w:ascii="Calibri" w:cs="Calibri" w:eastAsia="Calibri" w:hAnsi="Calibri"/>
+          <w:rFonts w:ascii="Cambria" w:cs="Cambria" w:eastAsia="Cambria" w:hAnsi="Cambria"/>
           <w:b/>
           <w:bCs/>
           <w:sz w:val="34"/>
@@ -25,7 +25,7 @@
       </w:pPr>
       <w:r>
         <w:rPr>
-          <w:rFonts w:ascii="Calibri" w:cs="Calibri" w:eastAsia="Calibri" w:hAnsi="Calibri"/>
+          <w:rFonts w:ascii="Cambria" w:cs="Cambria" w:eastAsia="Cambria" w:hAnsi="Cambria"/>
           <w:color w:val="444444"/>
           <w:sz w:val="18"/>
           <w:szCs w:val="18"/>
@@ -47,7 +47,7 @@
       </w:pPr>
       <w:r>
         <w:rPr>
-          <w:rFonts w:ascii="Calibri" w:cs="Calibri" w:eastAsia="Calibri" w:hAnsi="Calibri"/>
+          <w:rFonts w:ascii="Cambria" w:cs="Cambria" w:eastAsia="Cambria" w:hAnsi="Cambria"/>
           <w:sz w:val="20"/>
           <w:szCs w:val="20"/>
         </w:rPr>
@@ -60,7 +60,7 @@
       </w:pPr>
       <w:r>
         <w:rPr>
-          <w:rFonts w:ascii="Calibri" w:cs="Calibri" w:eastAsia="Calibri" w:hAnsi="Calibri"/>
+          <w:rFonts w:ascii="Cambria" w:cs="Cambria" w:eastAsia="Cambria" w:hAnsi="Cambria"/>
           <w:b/>
           <w:bCs/>
           <w:color w:val="333333"/>
@@ -79,7 +79,7 @@
       </w:pPr>
       <w:r>
         <w:rPr>
-          <w:rFonts w:ascii="Calibri" w:cs="Calibri" w:eastAsia="Calibri" w:hAnsi="Calibri"/>
+          <w:rFonts w:ascii="Cambria" w:cs="Cambria" w:eastAsia="Cambria" w:hAnsi="Cambria"/>
           <w:b/>
           <w:bCs/>
           <w:color w:val="1A1A1A"/>
@@ -99,7 +99,7 @@
       </w:pPr>
       <w:r>
         <w:rPr>
-          <w:rFonts w:ascii="Calibri" w:cs="Calibri" w:eastAsia="Calibri" w:hAnsi="Calibri"/>
+          <w:rFonts w:ascii="Cambria" w:cs="Cambria" w:eastAsia="Cambria" w:hAnsi="Cambria"/>
           <w:b/>
           <w:bCs/>
           <w:sz w:val="20"/>
@@ -109,7 +109,7 @@
       </w:r>
       <w:r>
         <w:rPr>
-          <w:rFonts w:ascii="Calibri" w:cs="Calibri" w:eastAsia="Calibri" w:hAnsi="Calibri"/>
+          <w:rFonts w:ascii="Cambria" w:cs="Cambria" w:eastAsia="Cambria" w:hAnsi="Cambria"/>
           <w:i/>
           <w:iCs/>
           <w:color w:val="444444"/>
@@ -130,7 +130,7 @@
       </w:pPr>
       <w:r>
         <w:rPr>
-          <w:rFonts w:ascii="Calibri" w:cs="Calibri" w:eastAsia="Calibri" w:hAnsi="Calibri"/>
+          <w:rFonts w:ascii="Cambria" w:cs="Cambria" w:eastAsia="Cambria" w:hAnsi="Cambria"/>
           <w:sz w:val="20"/>
           <w:szCs w:val="20"/>
         </w:rPr>
@@ -148,7 +148,7 @@
       </w:pPr>
       <w:r>
         <w:rPr>
-          <w:rFonts w:ascii="Calibri" w:cs="Calibri" w:eastAsia="Calibri" w:hAnsi="Calibri"/>
+          <w:rFonts w:ascii="Cambria" w:cs="Cambria" w:eastAsia="Cambria" w:hAnsi="Cambria"/>
           <w:sz w:val="20"/>
           <w:szCs w:val="20"/>
         </w:rPr>
@@ -166,7 +166,7 @@
       </w:pPr>
       <w:r>
         <w:rPr>
-          <w:rFonts w:ascii="Calibri" w:cs="Calibri" w:eastAsia="Calibri" w:hAnsi="Calibri"/>
+          <w:rFonts w:ascii="Cambria" w:cs="Cambria" w:eastAsia="Cambria" w:hAnsi="Cambria"/>
           <w:sz w:val="20"/>
           <w:szCs w:val="20"/>
         </w:rPr>
@@ -184,7 +184,7 @@
       </w:pPr>
       <w:r>
         <w:rPr>
-          <w:rFonts w:ascii="Calibri" w:cs="Calibri" w:eastAsia="Calibri" w:hAnsi="Calibri"/>
+          <w:rFonts w:ascii="Cambria" w:cs="Cambria" w:eastAsia="Cambria" w:hAnsi="Cambria"/>
           <w:sz w:val="20"/>
           <w:szCs w:val="20"/>
         </w:rPr>
@@ -202,7 +202,7 @@
       </w:pPr>
       <w:r>
         <w:rPr>
-          <w:rFonts w:ascii="Calibri" w:cs="Calibri" w:eastAsia="Calibri" w:hAnsi="Calibri"/>
+          <w:rFonts w:ascii="Cambria" w:cs="Cambria" w:eastAsia="Cambria" w:hAnsi="Cambria"/>
           <w:sz w:val="20"/>
           <w:szCs w:val="20"/>
         </w:rPr>
@@ -220,7 +220,7 @@
       </w:pPr>
       <w:r>
         <w:rPr>
-          <w:rFonts w:ascii="Calibri" w:cs="Calibri" w:eastAsia="Calibri" w:hAnsi="Calibri"/>
+          <w:rFonts w:ascii="Cambria" w:cs="Cambria" w:eastAsia="Cambria" w:hAnsi="Cambria"/>
           <w:sz w:val="20"/>
           <w:szCs w:val="20"/>
         </w:rPr>
@@ -236,7 +236,7 @@
       </w:pPr>
       <w:r>
         <w:rPr>
-          <w:rFonts w:ascii="Calibri" w:cs="Calibri" w:eastAsia="Calibri" w:hAnsi="Calibri"/>
+          <w:rFonts w:ascii="Cambria" w:cs="Cambria" w:eastAsia="Cambria" w:hAnsi="Cambria"/>
           <w:b/>
           <w:bCs/>
           <w:sz w:val="20"/>
@@ -246,7 +246,7 @@
       </w:r>
       <w:r>
         <w:rPr>
-          <w:rFonts w:ascii="Calibri" w:cs="Calibri" w:eastAsia="Calibri" w:hAnsi="Calibri"/>
+          <w:rFonts w:ascii="Cambria" w:cs="Cambria" w:eastAsia="Cambria" w:hAnsi="Cambria"/>
           <w:i/>
           <w:iCs/>
           <w:color w:val="444444"/>
@@ -267,7 +267,7 @@
       </w:pPr>
       <w:r>
         <w:rPr>
-          <w:rFonts w:ascii="Calibri" w:cs="Calibri" w:eastAsia="Calibri" w:hAnsi="Calibri"/>
+          <w:rFonts w:ascii="Cambria" w:cs="Cambria" w:eastAsia="Cambria" w:hAnsi="Cambria"/>
           <w:sz w:val="20"/>
           <w:szCs w:val="20"/>
         </w:rPr>
@@ -285,7 +285,7 @@
       </w:pPr>
       <w:r>
         <w:rPr>
-          <w:rFonts w:ascii="Calibri" w:cs="Calibri" w:eastAsia="Calibri" w:hAnsi="Calibri"/>
+          <w:rFonts w:ascii="Cambria" w:cs="Cambria" w:eastAsia="Cambria" w:hAnsi="Cambria"/>
           <w:sz w:val="20"/>
           <w:szCs w:val="20"/>
         </w:rPr>
@@ -303,7 +303,7 @@
       </w:pPr>
       <w:r>
         <w:rPr>
-          <w:rFonts w:ascii="Calibri" w:cs="Calibri" w:eastAsia="Calibri" w:hAnsi="Calibri"/>
+          <w:rFonts w:ascii="Cambria" w:cs="Cambria" w:eastAsia="Cambria" w:hAnsi="Cambria"/>
           <w:sz w:val="20"/>
           <w:szCs w:val="20"/>
         </w:rPr>
@@ -319,7 +319,7 @@
       </w:pPr>
       <w:r>
         <w:rPr>
-          <w:rFonts w:ascii="Calibri" w:cs="Calibri" w:eastAsia="Calibri" w:hAnsi="Calibri"/>
+          <w:rFonts w:ascii="Cambria" w:cs="Cambria" w:eastAsia="Cambria" w:hAnsi="Cambria"/>
           <w:b/>
           <w:bCs/>
           <w:sz w:val="20"/>
@@ -329,7 +329,7 @@
       </w:r>
       <w:r>
         <w:rPr>
-          <w:rFonts w:ascii="Calibri" w:cs="Calibri" w:eastAsia="Calibri" w:hAnsi="Calibri"/>
+          <w:rFonts w:ascii="Cambria" w:cs="Cambria" w:eastAsia="Cambria" w:hAnsi="Cambria"/>
           <w:i/>
           <w:iCs/>
           <w:color w:val="444444"/>
@@ -350,7 +350,7 @@
       </w:pPr>
       <w:r>
         <w:rPr>
-          <w:rFonts w:ascii="Calibri" w:cs="Calibri" w:eastAsia="Calibri" w:hAnsi="Calibri"/>
+          <w:rFonts w:ascii="Cambria" w:cs="Cambria" w:eastAsia="Cambria" w:hAnsi="Cambria"/>
           <w:sz w:val="20"/>
           <w:szCs w:val="20"/>
         </w:rPr>
@@ -368,7 +368,7 @@
       </w:pPr>
       <w:r>
         <w:rPr>
-          <w:rFonts w:ascii="Calibri" w:cs="Calibri" w:eastAsia="Calibri" w:hAnsi="Calibri"/>
+          <w:rFonts w:ascii="Cambria" w:cs="Cambria" w:eastAsia="Cambria" w:hAnsi="Cambria"/>
           <w:sz w:val="20"/>
           <w:szCs w:val="20"/>
         </w:rPr>
@@ -386,7 +386,7 @@
       </w:pPr>
       <w:r>
         <w:rPr>
-          <w:rFonts w:ascii="Calibri" w:cs="Calibri" w:eastAsia="Calibri" w:hAnsi="Calibri"/>
+          <w:rFonts w:ascii="Cambria" w:cs="Cambria" w:eastAsia="Cambria" w:hAnsi="Cambria"/>
           <w:sz w:val="20"/>
           <w:szCs w:val="20"/>
         </w:rPr>
@@ -402,7 +402,7 @@
       </w:pPr>
       <w:r>
         <w:rPr>
-          <w:rFonts w:ascii="Calibri" w:cs="Calibri" w:eastAsia="Calibri" w:hAnsi="Calibri"/>
+          <w:rFonts w:ascii="Cambria" w:cs="Cambria" w:eastAsia="Cambria" w:hAnsi="Cambria"/>
           <w:b/>
           <w:bCs/>
           <w:sz w:val="20"/>
@@ -412,7 +412,7 @@
       </w:r>
       <w:r>
         <w:rPr>
-          <w:rFonts w:ascii="Calibri" w:cs="Calibri" w:eastAsia="Calibri" w:hAnsi="Calibri"/>
+          <w:rFonts w:ascii="Cambria" w:cs="Cambria" w:eastAsia="Cambria" w:hAnsi="Cambria"/>
           <w:i/>
           <w:iCs/>
           <w:color w:val="444444"/>
@@ -433,7 +433,7 @@
       </w:pPr>
       <w:r>
         <w:rPr>
-          <w:rFonts w:ascii="Calibri" w:cs="Calibri" w:eastAsia="Calibri" w:hAnsi="Calibri"/>
+          <w:rFonts w:ascii="Cambria" w:cs="Cambria" w:eastAsia="Cambria" w:hAnsi="Cambria"/>
           <w:sz w:val="20"/>
           <w:szCs w:val="20"/>
         </w:rPr>
@@ -449,7 +449,7 @@
       </w:pPr>
       <w:r>
         <w:rPr>
-          <w:rFonts w:ascii="Calibri" w:cs="Calibri" w:eastAsia="Calibri" w:hAnsi="Calibri"/>
+          <w:rFonts w:ascii="Cambria" w:cs="Cambria" w:eastAsia="Cambria" w:hAnsi="Cambria"/>
           <w:b/>
           <w:bCs/>
           <w:sz w:val="20"/>
@@ -459,7 +459,7 @@
       </w:r>
       <w:r>
         <w:rPr>
-          <w:rFonts w:ascii="Calibri" w:cs="Calibri" w:eastAsia="Calibri" w:hAnsi="Calibri"/>
+          <w:rFonts w:ascii="Cambria" w:cs="Cambria" w:eastAsia="Cambria" w:hAnsi="Cambria"/>
           <w:i/>
           <w:iCs/>
           <w:color w:val="444444"/>
@@ -480,7 +480,7 @@
       </w:pPr>
       <w:r>
         <w:rPr>
-          <w:rFonts w:ascii="Calibri" w:cs="Calibri" w:eastAsia="Calibri" w:hAnsi="Calibri"/>
+          <w:rFonts w:ascii="Cambria" w:cs="Cambria" w:eastAsia="Cambria" w:hAnsi="Cambria"/>
           <w:sz w:val="20"/>
           <w:szCs w:val="20"/>
         </w:rPr>
@@ -496,7 +496,7 @@
       </w:pPr>
       <w:r>
         <w:rPr>
-          <w:rFonts w:ascii="Calibri" w:cs="Calibri" w:eastAsia="Calibri" w:hAnsi="Calibri"/>
+          <w:rFonts w:ascii="Cambria" w:cs="Cambria" w:eastAsia="Cambria" w:hAnsi="Cambria"/>
           <w:b/>
           <w:bCs/>
           <w:sz w:val="20"/>
@@ -506,7 +506,7 @@
       </w:r>
       <w:r>
         <w:rPr>
-          <w:rFonts w:ascii="Calibri" w:cs="Calibri" w:eastAsia="Calibri" w:hAnsi="Calibri"/>
+          <w:rFonts w:ascii="Cambria" w:cs="Cambria" w:eastAsia="Cambria" w:hAnsi="Cambria"/>
           <w:i/>
           <w:iCs/>
           <w:color w:val="444444"/>
@@ -527,7 +527,7 @@
       </w:pPr>
       <w:r>
         <w:rPr>
-          <w:rFonts w:ascii="Calibri" w:cs="Calibri" w:eastAsia="Calibri" w:hAnsi="Calibri"/>
+          <w:rFonts w:ascii="Cambria" w:cs="Cambria" w:eastAsia="Cambria" w:hAnsi="Cambria"/>
           <w:sz w:val="20"/>
           <w:szCs w:val="20"/>
         </w:rPr>
@@ -543,7 +543,7 @@
       </w:pPr>
       <w:r>
         <w:rPr>
-          <w:rFonts w:ascii="Calibri" w:cs="Calibri" w:eastAsia="Calibri" w:hAnsi="Calibri"/>
+          <w:rFonts w:ascii="Cambria" w:cs="Cambria" w:eastAsia="Cambria" w:hAnsi="Cambria"/>
           <w:b/>
           <w:bCs/>
           <w:sz w:val="20"/>
@@ -553,7 +553,7 @@
       </w:r>
       <w:r>
         <w:rPr>
-          <w:rFonts w:ascii="Calibri" w:cs="Calibri" w:eastAsia="Calibri" w:hAnsi="Calibri"/>
+          <w:rFonts w:ascii="Cambria" w:cs="Cambria" w:eastAsia="Cambria" w:hAnsi="Cambria"/>
           <w:i/>
           <w:iCs/>
           <w:color w:val="444444"/>
@@ -574,7 +574,7 @@
       </w:pPr>
       <w:r>
         <w:rPr>
-          <w:rFonts w:ascii="Calibri" w:cs="Calibri" w:eastAsia="Calibri" w:hAnsi="Calibri"/>
+          <w:rFonts w:ascii="Cambria" w:cs="Cambria" w:eastAsia="Cambria" w:hAnsi="Cambria"/>
           <w:sz w:val="20"/>
           <w:szCs w:val="20"/>
         </w:rPr>
@@ -590,7 +590,7 @@
       </w:pPr>
       <w:r>
         <w:rPr>
-          <w:rFonts w:ascii="Calibri" w:cs="Calibri" w:eastAsia="Calibri" w:hAnsi="Calibri"/>
+          <w:rFonts w:ascii="Cambria" w:cs="Cambria" w:eastAsia="Cambria" w:hAnsi="Cambria"/>
           <w:b/>
           <w:bCs/>
           <w:sz w:val="20"/>
@@ -600,7 +600,7 @@
       </w:r>
       <w:r>
         <w:rPr>
-          <w:rFonts w:ascii="Calibri" w:cs="Calibri" w:eastAsia="Calibri" w:hAnsi="Calibri"/>
+          <w:rFonts w:ascii="Cambria" w:cs="Cambria" w:eastAsia="Cambria" w:hAnsi="Cambria"/>
           <w:i/>
           <w:iCs/>
           <w:color w:val="444444"/>
@@ -621,7 +621,7 @@
       </w:pPr>
       <w:r>
         <w:rPr>
-          <w:rFonts w:ascii="Calibri" w:cs="Calibri" w:eastAsia="Calibri" w:hAnsi="Calibri"/>
+          <w:rFonts w:ascii="Cambria" w:cs="Cambria" w:eastAsia="Cambria" w:hAnsi="Cambria"/>
           <w:sz w:val="20"/>
           <w:szCs w:val="20"/>
         </w:rPr>
@@ -637,7 +637,7 @@
       </w:pPr>
       <w:r>
         <w:rPr>
-          <w:rFonts w:ascii="Calibri" w:cs="Calibri" w:eastAsia="Calibri" w:hAnsi="Calibri"/>
+          <w:rFonts w:ascii="Cambria" w:cs="Cambria" w:eastAsia="Cambria" w:hAnsi="Cambria"/>
           <w:b/>
           <w:bCs/>
           <w:color w:val="1A1A1A"/>
@@ -654,7 +654,7 @@
       </w:pPr>
       <w:r>
         <w:rPr>
-          <w:rFonts w:ascii="Calibri" w:cs="Calibri" w:eastAsia="Calibri" w:hAnsi="Calibri"/>
+          <w:rFonts w:ascii="Cambria" w:cs="Cambria" w:eastAsia="Cambria" w:hAnsi="Cambria"/>
           <w:sz w:val="20"/>
           <w:szCs w:val="20"/>
         </w:rPr>

</xml_diff>